<commit_message>
Add database design diagrams
Co-authored-by: Copilot <223556219+Copilot@users.noreply.github.com>
</commit_message>
<xml_diff>
--- a/StudyShare_Database_Design.docx
+++ b/StudyShare_Database_Design.docx
@@ -13,8 +13,6 @@
           <w:lang w:val="en-PH"/>
         </w:rPr>
       </w:pPr>
-      <w:bookmarkStart w:id="0" w:name="_GoBack"/>
-      <w:bookmarkEnd w:id="0"/>
       <w:r>
         <w:rPr>
           <w:rFonts w:hint="default" w:ascii="Times New Roman" w:hAnsi="Times New Roman" w:cs="Times New Roman"/>
@@ -819,42 +817,170 @@
     </w:p>
     <w:p>
       <w:pPr>
-        <w:pStyle w:val="6"/>
-        <w:spacing w:before="7"/>
-        <w:rPr>
-          <w:rFonts w:hint="default" w:ascii="Times New Roman" w:hAnsi="Times New Roman" w:cs="Times New Roman"/>
-          <w:b/>
-          <w:sz w:val="17"/>
+        <w:keepLines/>
+        <w:spacing w:before="40" w:after="0"/>
+        <w:jc w:val="center"/>
+      </w:pPr>
+    </w:p>
+    <w:p>
+      <w:pPr>
+        <w:pStyle w:val="2"/>
+        <w:spacing w:before="21"/>
+        <w:ind w:left="448"/>
+        <w:rPr>
+          <w:rFonts w:hint="default" w:ascii="Times New Roman" w:hAnsi="Times New Roman" w:cs="Times New Roman"/>
+          <w:lang w:val="en-PH"/>
         </w:rPr>
       </w:pPr>
       <w:r>
         <w:rPr>
           <w:rFonts w:hint="default" w:ascii="Times New Roman" w:hAnsi="Times New Roman" w:cs="Times New Roman"/>
-          <w:b/>
-          <w:sz w:val="17"/>
-        </w:rPr>
-        <w:t>Core concepts are user accounts and profiles, shared study notes, generated quiz sets, questions, quiz attempts, AI conversations, messages, file attachments, and chat-quiz attempts. A user owns their profile and can create notes, quizzes, attempts, and conversations.</w:t>
+          <w:lang w:val="en-PH"/>
+        </w:rPr>
+        <w:drawing>
+          <wp:inline distT="0" distB="0" distL="114300" distR="114300">
+            <wp:extent cx="6480810" cy="4968875"/>
+            <wp:effectExtent l="0" t="0" r="8890" b="9525"/>
+            <wp:docPr id="5" name="Picture 5" descr="StudyShare_Conceptual_Database_Diagram"/>
+            <wp:cNvGraphicFramePr>
+              <a:graphicFrameLocks xmlns:a="http://schemas.openxmlformats.org/drawingml/2006/main" noChangeAspect="1"/>
+            </wp:cNvGraphicFramePr>
+            <a:graphic xmlns:a="http://schemas.openxmlformats.org/drawingml/2006/main">
+              <a:graphicData uri="http://schemas.openxmlformats.org/drawingml/2006/picture">
+                <pic:pic xmlns:pic="http://schemas.openxmlformats.org/drawingml/2006/picture">
+                  <pic:nvPicPr>
+                    <pic:cNvPr id="5" name="Picture 5" descr="StudyShare_Conceptual_Database_Diagram"/>
+                    <pic:cNvPicPr>
+                      <a:picLocks noChangeAspect="1"/>
+                    </pic:cNvPicPr>
+                  </pic:nvPicPr>
+                  <pic:blipFill>
+                    <a:blip r:embed="rId4"/>
+                    <a:stretch>
+                      <a:fillRect/>
+                    </a:stretch>
+                  </pic:blipFill>
+                  <pic:spPr>
+                    <a:xfrm>
+                      <a:off x="0" y="0"/>
+                      <a:ext cx="6480810" cy="4968875"/>
+                    </a:xfrm>
+                    <a:prstGeom prst="rect">
+                      <a:avLst/>
+                    </a:prstGeom>
+                  </pic:spPr>
+                </pic:pic>
+              </a:graphicData>
+            </a:graphic>
+          </wp:inline>
+        </w:drawing>
+      </w:r>
+      <w:bookmarkStart w:id="0" w:name="_GoBack"/>
+      <w:bookmarkEnd w:id="0"/>
+    </w:p>
+    <w:p>
+      <w:pPr>
+        <w:pStyle w:val="2"/>
+        <w:spacing w:before="21"/>
+        <w:ind w:left="448"/>
+        <w:rPr>
+          <w:rFonts w:hint="default" w:ascii="Times New Roman" w:hAnsi="Times New Roman" w:cs="Times New Roman"/>
+        </w:rPr>
+      </w:pPr>
+    </w:p>
+    <w:p>
+      <w:pPr>
+        <w:pStyle w:val="2"/>
+        <w:spacing w:before="21"/>
+        <w:ind w:left="448"/>
+        <w:rPr>
+          <w:rFonts w:hint="default" w:ascii="Times New Roman" w:hAnsi="Times New Roman" w:cs="Times New Roman"/>
+        </w:rPr>
+      </w:pPr>
+      <w:r>
+        <w:rPr>
+          <w:rFonts w:hint="default" w:ascii="Times New Roman" w:hAnsi="Times New Roman" w:cs="Times New Roman"/>
+        </w:rPr>
+        <w:t>LOGICAL</w:t>
+      </w:r>
+      <w:r>
+        <w:rPr>
+          <w:rFonts w:hint="default" w:ascii="Times New Roman" w:hAnsi="Times New Roman" w:cs="Times New Roman"/>
+          <w:spacing w:val="-10"/>
+        </w:rPr>
+        <w:t xml:space="preserve"> </w:t>
+      </w:r>
+      <w:r>
+        <w:rPr>
+          <w:rFonts w:hint="default" w:ascii="Times New Roman" w:hAnsi="Times New Roman" w:cs="Times New Roman"/>
+          <w:spacing w:val="-2"/>
+        </w:rPr>
+        <w:t>DESIGN</w:t>
       </w:r>
     </w:p>
     <w:p>
       <w:pPr>
-        <w:pStyle w:val="6"/>
-        <w:rPr>
-          <w:rFonts w:hint="default" w:ascii="Times New Roman" w:hAnsi="Times New Roman" w:cs="Times New Roman"/>
-          <w:b/>
-          <w:sz w:val="17"/>
-        </w:rPr>
-        <w:sectPr>
-          <w:pgSz w:w="11910" w:h="16840"/>
-          <w:pgMar w:top="1400" w:right="708" w:bottom="280" w:left="992" w:header="720" w:footer="720" w:gutter="0"/>
-          <w:cols w:space="720" w:num="1"/>
-        </w:sectPr>
+        <w:keepLines/>
+        <w:spacing w:before="40" w:after="0"/>
+        <w:jc w:val="center"/>
       </w:pPr>
       <w:r>
-        <w:rPr>
-          <w:rFonts w:hint="default" w:ascii="Times New Roman" w:hAnsi="Times New Roman" w:cs="Times New Roman"/>
-        </w:rPr>
-        <w:t>A quiz set is anchored to a primary note and contains ordered questions. A conversation contains ordered messages; an assistant message may carry quiz data and uploaded attachments may be associated with a message.</w:t>
+        <w:drawing>
+          <wp:inline distT="0" distB="0" distL="114300" distR="114300">
+            <wp:extent cx="5715000" cy="2857500"/>
+            <wp:effectExtent l="0" t="0" r="0" b="0"/>
+            <wp:docPr id="3" name="Picture 3" descr="Logical schema grouped by identity, study and assessment, and AI chat; shows the 10 application tables, primary keys and foreign keys."/>
+            <wp:cNvGraphicFramePr>
+              <a:graphicFrameLocks xmlns:a="http://schemas.openxmlformats.org/drawingml/2006/main" noChangeAspect="1"/>
+            </wp:cNvGraphicFramePr>
+            <a:graphic xmlns:a="http://schemas.openxmlformats.org/drawingml/2006/main">
+              <a:graphicData uri="http://schemas.openxmlformats.org/drawingml/2006/picture">
+                <pic:pic xmlns:pic="http://schemas.openxmlformats.org/drawingml/2006/picture">
+                  <pic:nvPicPr>
+                    <pic:cNvPr id="3" name="Picture 3" descr="Logical schema grouped by identity, study and assessment, and AI chat; shows the 10 application tables, primary keys and foreign keys."/>
+                    <pic:cNvPicPr>
+                      <a:picLocks noChangeAspect="1"/>
+                    </pic:cNvPicPr>
+                  </pic:nvPicPr>
+                  <pic:blipFill>
+                    <a:blip r:embed="rId5">
+                      <a:extLst>
+                        <a:ext uri="{96DAC541-7B7A-43D3-8B79-37D633B846F1}">
+                          <asvg:svgBlip xmlns:asvg="http://schemas.microsoft.com/office/drawing/2016/SVG/main" r:embed="rId6"/>
+                        </a:ext>
+                      </a:extLst>
+                    </a:blip>
+                    <a:stretch>
+                      <a:fillRect/>
+                    </a:stretch>
+                  </pic:blipFill>
+                  <pic:spPr>
+                    <a:xfrm>
+                      <a:off x="0" y="0"/>
+                      <a:ext cx="5715000" cy="2857500"/>
+                    </a:xfrm>
+                    <a:prstGeom prst="rect">
+                      <a:avLst/>
+                    </a:prstGeom>
+                  </pic:spPr>
+                </pic:pic>
+              </a:graphicData>
+            </a:graphic>
+          </wp:inline>
+        </w:drawing>
+      </w:r>
+    </w:p>
+    <w:p>
+      <w:pPr>
+        <w:keepNext/>
+        <w:spacing w:before="60" w:after="100"/>
+        <w:jc w:val="center"/>
+      </w:pPr>
+      <w:r>
+        <w:rPr>
+          <w:sz w:val="18"/>
+        </w:rPr>
+        <w:t>Figure: Logical Design overview</w:t>
       </w:r>
     </w:p>
     <w:p>
@@ -866,66 +992,6 @@
           <w:rFonts w:hint="default" w:ascii="Times New Roman" w:hAnsi="Times New Roman" w:cs="Times New Roman"/>
         </w:rPr>
       </w:pPr>
-      <w:r>
-        <w:rPr>
-          <w:rFonts w:hint="default" w:ascii="Times New Roman" w:hAnsi="Times New Roman" w:cs="Times New Roman"/>
-        </w:rPr>
-        <w:t>LOGICAL</w:t>
-      </w:r>
-      <w:r>
-        <w:rPr>
-          <w:rFonts w:hint="default" w:ascii="Times New Roman" w:hAnsi="Times New Roman" w:cs="Times New Roman"/>
-          <w:spacing w:val="-10"/>
-        </w:rPr>
-        <w:t xml:space="preserve"> </w:t>
-      </w:r>
-      <w:r>
-        <w:rPr>
-          <w:rFonts w:hint="default" w:ascii="Times New Roman" w:hAnsi="Times New Roman" w:cs="Times New Roman"/>
-          <w:spacing w:val="-2"/>
-        </w:rPr>
-        <w:t>DESIGN</w:t>
-      </w:r>
-    </w:p>
-    <w:p>
-      <w:pPr>
-        <w:pStyle w:val="6"/>
-        <w:spacing w:before="3"/>
-        <w:rPr>
-          <w:rFonts w:hint="default" w:ascii="Times New Roman" w:hAnsi="Times New Roman" w:cs="Times New Roman"/>
-          <w:b/>
-          <w:sz w:val="13"/>
-        </w:rPr>
-      </w:pPr>
-      <w:r>
-        <w:rPr>
-          <w:rFonts w:hint="default" w:ascii="Times New Roman" w:hAnsi="Times New Roman" w:cs="Times New Roman"/>
-          <w:b/>
-          <w:sz w:val="13"/>
-        </w:rPr>
-        <w:t>The logical schema contains 10 application-facing tables: auth_user plus nine StudyShare tables. Primary keys are id columns. Foreign keys connect profiles, notes, quizzes, questions, attempts, conversations, messages, attachments, and chat-quiz attempts as listed in the ERD relationship summary.</w:t>
-      </w:r>
-    </w:p>
-    <w:p>
-      <w:pPr>
-        <w:pStyle w:val="6"/>
-        <w:rPr>
-          <w:rFonts w:hint="default" w:ascii="Times New Roman" w:hAnsi="Times New Roman" w:cs="Times New Roman"/>
-          <w:b/>
-          <w:sz w:val="13"/>
-        </w:rPr>
-        <w:sectPr>
-          <w:pgSz w:w="11910" w:h="16840"/>
-          <w:pgMar w:top="1400" w:right="708" w:bottom="280" w:left="992" w:header="720" w:footer="720" w:gutter="0"/>
-          <w:cols w:space="720" w:num="1"/>
-        </w:sectPr>
-      </w:pPr>
-      <w:r>
-        <w:rPr>
-          <w:rFonts w:hint="default" w:ascii="Times New Roman" w:hAnsi="Times New Roman" w:cs="Times New Roman"/>
-        </w:rPr>
-        <w:t>The profile-to-user and conversation share-token relationships are unique. JSON fields store structured answer, quiz, and source-note payloads. Application-defined choice fields are validated by Django; SQLite does not add a CHECK constraint for each choice list.</w:t>
-      </w:r>
     </w:p>
     <w:p>
       <w:pPr>
@@ -936,6 +1002,13 @@
           <w:rFonts w:hint="default" w:ascii="Times New Roman" w:hAnsi="Times New Roman" w:cs="Times New Roman"/>
         </w:rPr>
       </w:pPr>
+    </w:p>
+    <w:p>
+      <w:pPr>
+        <w:pStyle w:val="2"/>
+        <w:spacing w:before="21"/>
+        <w:ind w:left="448"/>
+      </w:pPr>
       <w:r>
         <w:rPr>
           <w:rFonts w:hint="default" w:ascii="Times New Roman" w:hAnsi="Times New Roman" w:cs="Times New Roman"/>
@@ -959,37 +1032,56 @@
     </w:p>
     <w:p>
       <w:pPr>
-        <w:pStyle w:val="6"/>
-        <w:rPr>
-          <w:rFonts w:hint="default" w:ascii="Times New Roman" w:hAnsi="Times New Roman" w:cs="Times New Roman"/>
-          <w:b/>
-          <w:sz w:val="20"/>
+        <w:keepLines/>
+        <w:spacing w:before="40" w:after="0"/>
+        <w:jc w:val="both"/>
+        <w:rPr>
+          <w:rFonts w:hint="default"/>
+          <w:lang w:val="en-PH"/>
         </w:rPr>
       </w:pPr>
       <w:r>
         <w:rPr>
-          <w:rFonts w:hint="default" w:ascii="Times New Roman" w:hAnsi="Times New Roman" w:cs="Times New Roman"/>
-        </w:rPr>
-        <w:t>The deployed database is SQLite at SQL/db.sqlite3, managed through Django migrations. The project also supports optional MySQL/MariaDB. The dictionaries show SQLite-oriented storage types: integer keys, varchar/text, datetime, boolean, real, and JSON serialized as validated text.</w:t>
-      </w:r>
-    </w:p>
-    <w:p>
-      <w:pPr>
-        <w:pStyle w:val="6"/>
-        <w:spacing w:before="100"/>
-        <w:rPr>
-          <w:rFonts w:hint="default" w:ascii="Times New Roman" w:hAnsi="Times New Roman" w:cs="Times New Roman"/>
-          <w:b/>
-          <w:sz w:val="20"/>
-        </w:rPr>
-      </w:pPr>
-      <w:r>
-        <w:rPr>
-          <w:rFonts w:hint="default" w:ascii="Times New Roman" w:hAnsi="Times New Roman" w:cs="Times New Roman"/>
-          <w:b/>
-          <w:sz w:val="20"/>
-        </w:rPr>
-        <w:t>Indexes include note subject plus school_year, note status, instructor, topic, and school_year; users_profile.is_guest; unique auth_user.username, users_profile.user_id, and chat_conversation.share_token; and Django foreign-key indexes. Django internal permission, session, and migration tables are outside this application-table listing.</w:t>
+          <w:rFonts w:hint="default"/>
+          <w:lang w:val="en-PH"/>
+        </w:rPr>
+        <w:drawing>
+          <wp:inline distT="0" distB="0" distL="114300" distR="114300">
+            <wp:extent cx="6480810" cy="6877050"/>
+            <wp:effectExtent l="0" t="0" r="8890" b="6350"/>
+            <wp:docPr id="4" name="Picture 4" descr="StudyShare_Physical_Database_Schema"/>
+            <wp:cNvGraphicFramePr>
+              <a:graphicFrameLocks xmlns:a="http://schemas.openxmlformats.org/drawingml/2006/main" noChangeAspect="1"/>
+            </wp:cNvGraphicFramePr>
+            <a:graphic xmlns:a="http://schemas.openxmlformats.org/drawingml/2006/main">
+              <a:graphicData uri="http://schemas.openxmlformats.org/drawingml/2006/picture">
+                <pic:pic xmlns:pic="http://schemas.openxmlformats.org/drawingml/2006/picture">
+                  <pic:nvPicPr>
+                    <pic:cNvPr id="4" name="Picture 4" descr="StudyShare_Physical_Database_Schema"/>
+                    <pic:cNvPicPr>
+                      <a:picLocks noChangeAspect="1"/>
+                    </pic:cNvPicPr>
+                  </pic:nvPicPr>
+                  <pic:blipFill>
+                    <a:blip r:embed="rId7"/>
+                    <a:stretch>
+                      <a:fillRect/>
+                    </a:stretch>
+                  </pic:blipFill>
+                  <pic:spPr>
+                    <a:xfrm>
+                      <a:off x="0" y="0"/>
+                      <a:ext cx="6480810" cy="6877050"/>
+                    </a:xfrm>
+                    <a:prstGeom prst="rect">
+                      <a:avLst/>
+                    </a:prstGeom>
+                  </pic:spPr>
+                </pic:pic>
+              </a:graphicData>
+            </a:graphic>
+          </wp:inline>
+        </w:drawing>
       </w:r>
     </w:p>
     <w:p>
@@ -12407,6 +12499,7 @@
     <w:p>
       <w:pPr>
         <w:pStyle w:val="2"/>
+        <w:pageBreakBefore/>
         <w:spacing w:before="21"/>
         <w:ind w:left="448"/>
         <w:rPr>
@@ -12424,6 +12517,70 @@
           <w:spacing w:val="-2"/>
         </w:rPr>
         <w:t>ENTITY-RELATIONSHIP DIAGRAM (ERD)</w:t>
+      </w:r>
+    </w:p>
+    <w:p>
+      <w:pPr>
+        <w:keepLines/>
+        <w:spacing w:before="0" w:after="40"/>
+        <w:jc w:val="center"/>
+      </w:pPr>
+      <w:r>
+        <w:drawing>
+          <wp:inline distT="0" distB="0" distL="114300" distR="114300">
+            <wp:extent cx="5715000" cy="5191125"/>
+            <wp:effectExtent l="0" t="0" r="0" b="3175"/>
+            <wp:docPr id="1" name="Picture 1" descr="StudyShare ER diagram showing 10 entities, their primary and foreign keys, and all one-to-one and one-to-many relationships."/>
+            <wp:cNvGraphicFramePr>
+              <a:graphicFrameLocks xmlns:a="http://schemas.openxmlformats.org/drawingml/2006/main" noChangeAspect="1"/>
+            </wp:cNvGraphicFramePr>
+            <a:graphic xmlns:a="http://schemas.openxmlformats.org/drawingml/2006/main">
+              <a:graphicData uri="http://schemas.openxmlformats.org/drawingml/2006/picture">
+                <pic:pic xmlns:pic="http://schemas.openxmlformats.org/drawingml/2006/picture">
+                  <pic:nvPicPr>
+                    <pic:cNvPr id="1" name="Picture 1" descr="StudyShare ER diagram showing 10 entities, their primary and foreign keys, and all one-to-one and one-to-many relationships."/>
+                    <pic:cNvPicPr>
+                      <a:picLocks noChangeAspect="1"/>
+                    </pic:cNvPicPr>
+                  </pic:nvPicPr>
+                  <pic:blipFill>
+                    <a:blip r:embed="rId8">
+                      <a:extLst>
+                        <a:ext uri="{96DAC541-7B7A-43D3-8B79-37D633B846F1}">
+                          <asvg:svgBlip xmlns:asvg="http://schemas.microsoft.com/office/drawing/2016/SVG/main" r:embed="rId9"/>
+                        </a:ext>
+                      </a:extLst>
+                    </a:blip>
+                    <a:stretch>
+                      <a:fillRect/>
+                    </a:stretch>
+                  </pic:blipFill>
+                  <pic:spPr>
+                    <a:xfrm>
+                      <a:off x="0" y="0"/>
+                      <a:ext cx="5715000" cy="5191125"/>
+                    </a:xfrm>
+                    <a:prstGeom prst="rect">
+                      <a:avLst/>
+                    </a:prstGeom>
+                  </pic:spPr>
+                </pic:pic>
+              </a:graphicData>
+            </a:graphic>
+          </wp:inline>
+        </w:drawing>
+      </w:r>
+    </w:p>
+    <w:p>
+      <w:pPr>
+        <w:spacing w:after="160"/>
+        <w:jc w:val="center"/>
+      </w:pPr>
+      <w:r>
+        <w:rPr>
+          <w:sz w:val="18"/>
+        </w:rPr>
+        <w:t>PK = primary key; FK = foreign key; 1:1 = one-to-one; 1:M = one-to-many.</w:t>
       </w:r>
     </w:p>
     <w:p>

</xml_diff>